<commit_message>
Address the audit: correctness guards, full theming, clearer states and feedback
</commit_message>
<xml_diff>
--- a/README.docx
+++ b/README.docx
@@ -144,6 +144,21 @@
         <w:jc w:val="left"/>
       </w:pPr>
       <w:r>
+        <w:t xml:space="preserve">The skins cover the dialogs as well, so switching skin changes the whole application and not only the main window.</w:t>
+      </w:r>
+    </w:p>
+    <w:p>
+      <w:pPr>
+        <w:pStyle w:val="ListParagraph"/>
+        <w:numPr>
+          <w:ilvl w:val="0"/>
+          <w:numId w:val="2"/>
+        </w:numPr>
+        <w:bidi w:val="false"/>
+        <w:spacing w:after="60"/>
+        <w:jc w:val="left"/>
+      </w:pPr>
+      <w:r>
         <w:t xml:space="preserve">3 - Charts. Every event's details include a chart of both option prices against the trades made, and it is drawn for both LMSR and order book events.</w:t>
       </w:r>
     </w:p>
@@ -251,7 +266,7 @@
         <w:jc w:val="left"/>
       </w:pPr>
       <w:r>
-        <w:t xml:space="preserve">The window has two tabs. The Events tab is for looking around: it lists every event with its status, type, commission and account, and it has three filter rows (type, status, commission) where every row also has an "All" option. Clicking an event shows its full details - for LMSR the prices, account, trade history and chart, and for an order book both books with their bids, asks and statistics, plus the participants.</w:t>
+        <w:t xml:space="preserve">Money is always shown with a $ so it cannot be mistaken for a number of shares, and columns of numbers can be sorted by value.</w:t>
       </w:r>
     </w:p>
     <w:p>
@@ -261,6 +276,16 @@
         <w:jc w:val="left"/>
       </w:pPr>
       <w:r>
+        <w:t xml:space="preserve">The window has two tabs. The Events tab is for looking around: it lists every event with its status, method, commission and account, and it has filters for method, status and commission where each one also has an "All" option. Clicking an event shows its full details - for LMSR the prices, account, trade history and chart, and for an order book both books with their bids, asks and statistics, plus the participants.</w:t>
+      </w:r>
+    </w:p>
+    <w:p>
+      <w:pPr>
+        <w:bidi w:val="false"/>
+        <w:spacing w:after="110"/>
+        <w:jc w:val="left"/>
+      </w:pPr>
+      <w:r>
         <w:t xml:space="preserve">Everything you actually do happens in the Users tab, because every action belongs to somebody. Pick a user on the left, then pick one of their events, and the buttons that appear are the ones that user is allowed to press right now: opening an event if they are its market maker and it has not started, closing it if it is running, and buying shares or placing an order while it is active.</w:t>
       </w:r>
     </w:p>
@@ -495,6 +520,36 @@
       </w:pPr>
       <w:r>
         <w:t xml:space="preserve">A user cannot sell shares they do not own.</w:t>
+      </w:r>
+    </w:p>
+    <w:p>
+      <w:pPr>
+        <w:pStyle w:val="ListParagraph"/>
+        <w:numPr>
+          <w:ilvl w:val="0"/>
+          <w:numId w:val="2"/>
+        </w:numPr>
+        <w:bidi w:val="false"/>
+        <w:spacing w:after="60"/>
+        <w:jc w:val="left"/>
+      </w:pPr>
+      <w:r>
+        <w:t xml:space="preserve">Before an order or a purchase is confirmed the screen shows what it will cost, and warns if the account cannot cover it. The same check is used by the engine itself, so the two can never disagree.</w:t>
+      </w:r>
+    </w:p>
+    <w:p>
+      <w:pPr>
+        <w:pStyle w:val="ListParagraph"/>
+        <w:numPr>
+          <w:ilvl w:val="0"/>
+          <w:numId w:val="2"/>
+        </w:numPr>
+        <w:bidi w:val="false"/>
+        <w:spacing w:after="60"/>
+        <w:jc w:val="left"/>
+      </w:pPr>
+      <w:r>
+        <w:t xml:space="preserve">A blocked user cannot do anything at all, including closing an event they are the market maker of.</w:t>
       </w:r>
     </w:p>
     <w:p>

</xml_diff>

<commit_message>
Refuse a purchase that costs less than a cent
Once one option of an LMSR event has been bought heavily the other falls
towards zero, and a purchase of it works out to a fraction of a cent: 200
shares came to $0.0002, which the screen rounded to $0.00. The shares were
handed over for nothing and still paid out a dollar each if that option won.

Money is only ever held and shown to the cent, so a charge smaller than that
is not a real price. Such a purchase is now refused, and the quote says so
before the buy is confirmed instead of showing a cost of $0.00. Prices at or
above a cent are untouched, so a genuinely cheap option still trades.

Two neighbours of the same problem go with it: a quantity large enough to
overflow the share count reported an internal message about withdrawing a
negative amount, and amounts under half a cent printed as "-$0.00".

Co-Authored-By: Claude Opus 5 <noreply@anthropic.com>
</commit_message>
<xml_diff>
--- a/README.docx
+++ b/README.docx
@@ -565,6 +565,21 @@
       </w:pPr>
       <w:r>
         <w:t xml:space="preserve">Prices are given in whole cents, between 0.01 and d minus 0.01.</w:t>
+      </w:r>
+    </w:p>
+    <w:p>
+      <w:pPr>
+        <w:pStyle w:val="ListParagraph"/>
+        <w:numPr>
+          <w:ilvl w:val="0"/>
+          <w:numId w:val="2"/>
+        </w:numPr>
+        <w:bidi w:val="false"/>
+        <w:spacing w:after="60"/>
+        <w:jc w:val="left"/>
+      </w:pPr>
+      <w:r>
+        <w:t xml:space="preserve">A purchase must come to at least $0.01. In LMSR, once one option has been bought heavily the other falls towards zero, and a purchase of it can work out to a fraction of a cent. Since money is only ever shown and held to the cent, that would hand over shares for nothing while still paying out in full if that option won. Such a purchase is refused, and the screen says so before the buy is confirmed rather than showing a misleading cost of $0.00. This only limits prices below one cent; a genuinely cheap option at $0.02 can still be bought normally, which is the market working as it should.</w:t>
       </w:r>
     </w:p>
     <w:p>

</xml_diff>

<commit_message>
Ship two jars and run them with a bare java -jar
The exercise asks for at least two modules and two jars from them, so the
build now produces engine.jar for the system and guess-market.jar for the
interface, with no classes shared between them.

The JavaFX runtime and the four native libraries it actually needs travel
inside the interface jar, and the manifest names engine.jar on its class path,
so the batch file is one line: java -jar guess-market.jar. No module path, no
switches, and no folder of libraries to keep alongside. Only the modules the
application uses are bundled, which is why 98MB of web and media libraries
stay behind and the whole submission is under 10MB.

Co-Authored-By: Claude Opus 5 <noreply@anthropic.com>
</commit_message>
<xml_diff>
--- a/README.docx
+++ b/README.docx
@@ -200,22 +200,37 @@
         <w:jc w:val="left"/>
       </w:pPr>
       <w:r>
-        <w:t xml:space="preserve">Keep guess-market.jar, run.bat and the lib folder together in the same folder, then double click run.bat.</w:t>
-      </w:r>
-    </w:p>
-    <w:p>
-      <w:pPr>
-        <w:pStyle w:val="ListParagraph"/>
-        <w:numPr>
-          <w:ilvl w:val="0"/>
-          <w:numId w:val="2"/>
-        </w:numPr>
-        <w:bidi w:val="false"/>
-        <w:spacing w:after="60"/>
-        <w:jc w:val="left"/>
-      </w:pPr>
-      <w:r>
-        <w:t xml:space="preserve">The lib folder holds the JavaFX runtime. Without it the application cannot start, so please do not move or rename it.</w:t>
+        <w:t xml:space="preserve">Keep guess-market.jar, engine.jar and run.bat together in the same folder, then double click run.bat. Nothing else is needed and nothing has to be installed beyond Java itself.</w:t>
+      </w:r>
+    </w:p>
+    <w:p>
+      <w:pPr>
+        <w:pStyle w:val="ListParagraph"/>
+        <w:numPr>
+          <w:ilvl w:val="0"/>
+          <w:numId w:val="2"/>
+        </w:numPr>
+        <w:bidi w:val="false"/>
+        <w:spacing w:after="60"/>
+        <w:jc w:val="left"/>
+      </w:pPr>
+      <w:r>
+        <w:t xml:space="preserve">The exercise is built as two modules and ships as two jars: engine.jar is the system engine, and guess-market.jar is the user interface. The interface jar names the engine jar in its manifest, so "java -jar guess-market.jar" is the whole command.</w:t>
+      </w:r>
+    </w:p>
+    <w:p>
+      <w:pPr>
+        <w:pStyle w:val="ListParagraph"/>
+        <w:numPr>
+          <w:ilvl w:val="0"/>
+          <w:numId w:val="2"/>
+        </w:numPr>
+        <w:bidi w:val="false"/>
+        <w:spacing w:after="60"/>
+        <w:jc w:val="left"/>
+      </w:pPr>
+      <w:r>
+        <w:t xml:space="preserve">The JavaFX runtime is inside guess-market.jar, so the batch file needs no module path and no switches. JavaFX then runs from the class path rather than as a module, which makes it print one line at startup about an unsupported configuration. It is only a notice about packaging; the application is unaffected.</w:t>
       </w:r>
     </w:p>
     <w:p>

</xml_diff>

<commit_message>
Silence the packaging notice JavaFX prints at startup
Carrying the JavaFX runtime inside the jar means it loads from the class path
rather than as a module, and JavaFX announces that as an "unsupported
configuration" before the window appears. It reads like a fault, and is not
one: every suite passes against these jars.

The launcher turns off that single logger, so the notice no longer greets
whoever runs the batch file. Nothing else is quietened - any other message the
runtime or the application produces still reaches the console.

Co-Authored-By: Claude Opus 5 <noreply@anthropic.com>
</commit_message>
<xml_diff>
--- a/README.docx
+++ b/README.docx
@@ -215,22 +215,7 @@
         <w:jc w:val="left"/>
       </w:pPr>
       <w:r>
-        <w:t xml:space="preserve">The exercise is built as two modules and ships as two jars: engine.jar is the system engine, and guess-market.jar is the user interface. The interface jar names the engine jar in its manifest, so "java -jar guess-market.jar" is the whole command.</w:t>
-      </w:r>
-    </w:p>
-    <w:p>
-      <w:pPr>
-        <w:pStyle w:val="ListParagraph"/>
-        <w:numPr>
-          <w:ilvl w:val="0"/>
-          <w:numId w:val="2"/>
-        </w:numPr>
-        <w:bidi w:val="false"/>
-        <w:spacing w:after="60"/>
-        <w:jc w:val="left"/>
-      </w:pPr>
-      <w:r>
-        <w:t xml:space="preserve">The JavaFX runtime is inside guess-market.jar, so the batch file needs no module path and no switches. JavaFX then runs from the class path rather than as a module, which makes it print one line at startup about an unsupported configuration. It is only a notice about packaging; the application is unaffected.</w:t>
+        <w:t xml:space="preserve">The exercise is built as two modules and ships as two jars: engine.jar is the system engine, and guess-market.jar is the user interface. The JavaFX runtime sits inside the interface jar, which also names the engine jar in its manifest, so "java -jar guess-market.jar" is the whole command - no module path, no switches, and no folder of libraries to keep alongside.</w:t>
       </w:r>
     </w:p>
     <w:p>

</xml_diff>

<commit_message>
Add the balance chart the graphs bonus asks for, and saving progress
The graphs bonus has two halves: prices over trades within an event, and a
user's account over time within their details. Only the first was drawn, even
though the engine had been recording every balance movement all along and
offering them through getUserBalanceHistory. The users screen now shows that
history as a chart, in a pane beside the involvement panel.

Saving progress is not one of this exercise's bonuses, but every model class
was still serialisable from exercise 1 and the exception type was still there,
so the two engine methods and a pair of buttons bring it back. Saving writes
the whole market and loading restores it, resting orders and closed events
included, and the restored market can be traded in exactly as before.

Co-Authored-By: Claude Opus 5 <noreply@anthropic.com>
</commit_message>
<xml_diff>
--- a/README.docx
+++ b/README.docx
@@ -159,7 +159,7 @@
         <w:jc w:val="left"/>
       </w:pPr>
       <w:r>
-        <w:t xml:space="preserve">3 - Charts. Every event's details include a chart of both option prices against the trades made, and it is drawn for both LMSR and order book events.</w:t>
+        <w:t xml:space="preserve">3 - Charts. Both charts the bonus asks for are drawn. Every event's details include a chart of the two option prices against the trades made, for LMSR and order book events alike, and every user's details include a chart of their account balance after each movement of money.</w:t>
       </w:r>
     </w:p>
     <w:p>
@@ -231,6 +231,21 @@
       </w:pPr>
       <w:r>
         <w:t xml:space="preserve">Load a market file with the "Load File" button in the top bar. Only exercise 2 files are supported.</w:t>
+      </w:r>
+    </w:p>
+    <w:p>
+      <w:pPr>
+        <w:pStyle w:val="ListParagraph"/>
+        <w:numPr>
+          <w:ilvl w:val="0"/>
+          <w:numId w:val="2"/>
+        </w:numPr>
+        <w:bidi w:val="false"/>
+        <w:spacing w:after="60"/>
+        <w:jc w:val="left"/>
+      </w:pPr>
+      <w:r>
+        <w:t xml:space="preserve">The top bar also has Save Progress and Load Progress. Saving writes the whole market - balances, holdings, trades, resting orders and closed events - to a .gmstate file, and loading it picks up exactly where it was left. This is not one of the bonuses listed for this exercise; it is carried over from exercise 1, where the model classes were already made serialisable.</w:t>
       </w:r>
     </w:p>
     <w:p>

</xml_diff>

<commit_message>
Reword two lines of the readme
Co-Authored-By: Claude Opus 5 <noreply@anthropic.com>
</commit_message>
<xml_diff>
--- a/README.docx
+++ b/README.docx
@@ -99,7 +99,7 @@
         <w:jc w:val="left"/>
       </w:pPr>
       <w:r>
-        <w:t xml:space="preserve">All 4 bonuses. Bonuses 1 and 2 start switched off, the controls for them are in the top bar.</w:t>
+        <w:t xml:space="preserve">I implemented all 4 bonuses. Bonuses 1 and 2 start switched off, the controls for them are in the top bar.</w:t>
       </w:r>
     </w:p>
     <w:p>
@@ -251,7 +251,7 @@
         <w:jc w:val="left"/>
       </w:pPr>
       <w:r>
-        <w:t xml:space="preserve">How it is used</w:t>
+        <w:t xml:space="preserve">How to use it</w:t>
       </w:r>
     </w:p>
     <w:p>

</xml_diff>